<commit_message>
WF-17: all three changes now live in GHL, nothing open
Co-Authored-By: Claude Opus 5 <noreply@anthropic.com>
</commit_message>
<xml_diff>
--- a/campaigns/WF-17-long-term-nurture.docx
+++ b/campaigns/WF-17-long-term-nurture.docx
@@ -471,13 +471,13 @@
           <w:b/>
           <w:bCs/>
         </w:rPr>
-        <w:t xml:space="preserve">Bullet glyphs normalised.</w:t>
-      </w:r>
-      <w:r>
-        <w:t xml:space="preserve"> </w:t>
-      </w:r>
-      <w:r>
-        <w:t xml:space="preserve">The live version uses a non-ASCII</w:t>
+        <w:t xml:space="preserve">Bullet glyphs corrected in GHL, Aug 2.</w:t>
+      </w:r>
+      <w:r>
+        <w:t xml:space="preserve"> </w:t>
+      </w:r>
+      <w:r>
+        <w:t xml:space="preserve">The live version used a non-ASCII</w:t>
       </w:r>
       <w:r>
         <w:t xml:space="preserve"> </w:t>
@@ -492,7 +492,7 @@
         <w:t xml:space="preserve"> </w:t>
       </w:r>
       <w:r>
-        <w:t xml:space="preserve">with tab spacing, against the ASCII-only rule and inconsistent across email clients. Worth changing in GHL to plain hyphens, in the one email built entirely around a data table.</w:t>
+        <w:t xml:space="preserve">with tab spacing, against the ASCII-only rule and rendering inconsistently across email clients. Now plain hyphens in both GHL and this file.</w:t>
       </w:r>
     </w:p>
     <w:p>
@@ -1640,13 +1640,13 @@
       </w:r>
     </w:p>
     <w:bookmarkEnd w:id="17"/>
-    <w:bookmarkStart w:id="18" w:name="still-open"/>
+    <w:bookmarkStart w:id="18" w:name="nothing-open"/>
     <w:p>
       <w:pPr>
         <w:pStyle w:val="Heading2"/>
       </w:pPr>
       <w:r>
-        <w:t xml:space="preserve">Still open</w:t>
+        <w:t xml:space="preserve">Nothing open</w:t>
       </w:r>
     </w:p>
     <w:p>
@@ -1654,32 +1654,7 @@
         <w:pStyle w:val="FirstParagraph"/>
       </w:pPr>
       <w:r>
-        <w:rPr>
-          <w:b/>
-          <w:bCs/>
-        </w:rPr>
-        <w:t xml:space="preserve">Touch 2’s bullet glyphs.</w:t>
-      </w:r>
-      <w:r>
-        <w:t xml:space="preserve"> </w:t>
-      </w:r>
-      <w:r>
-        <w:t xml:space="preserve">The live version uses</w:t>
-      </w:r>
-      <w:r>
-        <w:t xml:space="preserve"> </w:t>
-      </w:r>
-      <w:r>
-        <w:rPr>
-          <w:rStyle w:val="VerbatimChar"/>
-        </w:rPr>
-        <w:t xml:space="preserve">●</w:t>
-      </w:r>
-      <w:r>
-        <w:t xml:space="preserve"> </w:t>
-      </w:r>
-      <w:r>
-        <w:t xml:space="preserve">with tab spacing rather than plain hyphens. Non-ASCII against the house rule, and it renders inconsistently across email clients. Worth fixing in GHL in the one email built entirely around a data table.</w:t>
+        <w:t xml:space="preserve">All three changes are live in GHL as of 2026-08-02, including the bullet-glyph normalisation in touch 2. GHL and this file match.</w:t>
       </w:r>
     </w:p>
     <w:bookmarkEnd w:id="18"/>

</xml_diff>